<commit_message>
docs(G3-09): correct test plan TOC pagination
</commit_message>
<xml_diff>
--- a/docs/deliverables/19-测试计划.docx
+++ b/docs/deliverables/19-测试计划.docx
@@ -936,7 +936,7 @@
         <w:tab/>
       </w:r>
       <w:r>
-        <w:t>11</w:t>
+        <w:t>7</w:t>
       </w:r>
     </w:p>
     <w:p>
@@ -953,7 +953,7 @@
         <w:tab/>
       </w:r>
       <w:r>
-        <w:t>11</w:t>
+        <w:t>8</w:t>
       </w:r>
     </w:p>
     <w:p>
@@ -970,7 +970,7 @@
         <w:tab/>
       </w:r>
       <w:r>
-        <w:t>11</w:t>
+        <w:t>8</w:t>
       </w:r>
     </w:p>
     <w:p>

</xml_diff>